<commit_message>
Naurot added Naurot's reume to report
</commit_message>
<xml_diff>
--- a/Naurot_3.docx
+++ b/Naurot_3.docx
@@ -71,10 +71,7 @@
       <w:r>
         <w:lastRenderedPageBreak/>
         <w:tab/>
-        <w:t>Christopher Chung</w:t>
-      </w:r>
-      <w:r>
-        <w:t xml:space="preserve"> Resume</w:t>
+        <w:t>Christopher Chung Resume</w:t>
       </w:r>
     </w:p>
     <w:p>
@@ -86,10 +83,7 @@
       <w:r>
         <w:lastRenderedPageBreak/>
         <w:tab/>
-        <w:t>Jamie Cooper</w:t>
-      </w:r>
-      <w:r>
-        <w:t xml:space="preserve"> Resume</w:t>
+        <w:t>Jamie Cooper Resume</w:t>
       </w:r>
     </w:p>
     <w:p>
@@ -101,10 +95,7 @@
       <w:r>
         <w:lastRenderedPageBreak/>
         <w:tab/>
-        <w:t>Ciana Hoggard</w:t>
-      </w:r>
-      <w:r>
-        <w:t xml:space="preserve"> Resume</w:t>
+        <w:t>Ciana Hoggard Resume</w:t>
       </w:r>
     </w:p>
     <w:p>
@@ -112,29 +103,63 @@
         <w:br w:type="page"/>
       </w:r>
     </w:p>
+    <w:p>
+      <w:r>
+        <w:rPr>
+          <w:noProof/>
+        </w:rPr>
+        <w:lastRenderedPageBreak/>
+        <w:drawing>
+          <wp:inline distT="0" distB="0" distL="0" distR="0" wp14:anchorId="73F792B7" wp14:editId="74202B91">
+            <wp:extent cx="6324600" cy="8305800"/>
+            <wp:effectExtent l="0" t="0" r="0" b="0"/>
+            <wp:docPr id="370818387" name="Picture 1" descr="A white paper with black text&#10;&#10;Description automatically generated"/>
+            <wp:cNvGraphicFramePr>
+              <a:graphicFrameLocks xmlns:a="http://schemas.openxmlformats.org/drawingml/2006/main" noChangeAspect="1"/>
+            </wp:cNvGraphicFramePr>
+            <a:graphic xmlns:a="http://schemas.openxmlformats.org/drawingml/2006/main">
+              <a:graphicData uri="http://schemas.openxmlformats.org/drawingml/2006/picture">
+                <pic:pic xmlns:pic="http://schemas.openxmlformats.org/drawingml/2006/picture">
+                  <pic:nvPicPr>
+                    <pic:cNvPr id="370818387" name="Picture 1" descr="A white paper with black text&#10;&#10;Description automatically generated"/>
+                    <pic:cNvPicPr/>
+                  </pic:nvPicPr>
+                  <pic:blipFill>
+                    <a:blip r:embed="rId5">
+                      <a:extLst>
+                        <a:ext uri="{28A0092B-C50C-407E-A947-70E740481C1C}">
+                          <a14:useLocalDpi xmlns:a14="http://schemas.microsoft.com/office/drawing/2010/main" val="0"/>
+                        </a:ext>
+                      </a:extLst>
+                    </a:blip>
+                    <a:stretch>
+                      <a:fillRect/>
+                    </a:stretch>
+                  </pic:blipFill>
+                  <pic:spPr>
+                    <a:xfrm>
+                      <a:off x="0" y="0"/>
+                      <a:ext cx="6324600" cy="8305800"/>
+                    </a:xfrm>
+                    <a:prstGeom prst="rect">
+                      <a:avLst/>
+                    </a:prstGeom>
+                  </pic:spPr>
+                </pic:pic>
+              </a:graphicData>
+            </a:graphic>
+          </wp:inline>
+        </w:drawing>
+      </w:r>
+      <w:r>
+        <w:br w:type="page"/>
+      </w:r>
+    </w:p>
     <w:p/>
     <w:p>
       <w:r>
         <w:tab/>
-        <w:t>James Naurot</w:t>
-      </w:r>
-      <w:r>
-        <w:t xml:space="preserve"> Resume</w:t>
-      </w:r>
-    </w:p>
-    <w:p>
-      <w:r>
-        <w:br w:type="page"/>
-      </w:r>
-    </w:p>
-    <w:p/>
-    <w:p>
-      <w:r>
-        <w:tab/>
-        <w:t>Bhuvan Sai Reddy Seelam</w:t>
-      </w:r>
-      <w:r>
-        <w:t xml:space="preserve"> Resume</w:t>
+        <w:t>Bhuvan Sai Reddy Seelam Resume</w:t>
       </w:r>
     </w:p>
     <w:p>
@@ -174,10 +199,7 @@
     <w:p>
       <w:r>
         <w:tab/>
-        <w:t xml:space="preserve">Summarize hint for handling </w:t>
-      </w:r>
-      <w:r>
-        <w:t>group problems</w:t>
+        <w:t>Summarize hint for handling group problems</w:t>
       </w:r>
     </w:p>
     <w:p>
@@ -226,6 +248,243 @@
     </w:sectPr>
   </w:body>
 </w:document>
+</file>
+
+<file path=word/numbering.xml><?xml version="1.0" encoding="utf-8"?>
+<w:numbering xmlns:wpc="http://schemas.microsoft.com/office/word/2010/wordprocessingCanvas" xmlns:cx="http://schemas.microsoft.com/office/drawing/2014/chartex" xmlns:cx1="http://schemas.microsoft.com/office/drawing/2015/9/8/chartex" xmlns:cx2="http://schemas.microsoft.com/office/drawing/2015/10/21/chartex" xmlns:cx3="http://schemas.microsoft.com/office/drawing/2016/5/9/chartex" xmlns:cx4="http://schemas.microsoft.com/office/drawing/2016/5/10/chartex" xmlns:cx5="http://schemas.microsoft.com/office/drawing/2016/5/11/chartex" xmlns:cx6="http://schemas.microsoft.com/office/drawing/2016/5/12/chartex" xmlns:cx7="http://schemas.microsoft.com/office/drawing/2016/5/13/chartex" xmlns:cx8="http://schemas.microsoft.com/office/drawing/2016/5/14/chartex" xmlns:mc="http://schemas.openxmlformats.org/markup-compatibility/2006" xmlns:aink="http://schemas.microsoft.com/office/drawing/2016/ink" xmlns:am3d="http://schemas.microsoft.com/office/drawing/2017/model3d" xmlns:o="urn:schemas-microsoft-com:office:office" xmlns:oel="http://schemas.microsoft.com/office/2019/extlst" xmlns:r="http://schemas.openxmlformats.org/officeDocument/2006/relationships" xmlns:m="http://schemas.openxmlformats.org/officeDocument/2006/math" xmlns:v="urn:schemas-microsoft-com:vml" xmlns:wp14="http://schemas.microsoft.com/office/word/2010/wordprocessingDrawing" xmlns:wp="http://schemas.openxmlformats.org/drawingml/2006/wordprocessingDrawing" xmlns:w10="urn:schemas-microsoft-com:office:word" xmlns:w="http://schemas.openxmlformats.org/wordprocessingml/2006/main" xmlns:w14="http://schemas.microsoft.com/office/word/2010/wordml" xmlns:w15="http://schemas.microsoft.com/office/word/2012/wordml" xmlns:w16cex="http://schemas.microsoft.com/office/word/2018/wordml/cex" xmlns:w16cid="http://schemas.microsoft.com/office/word/2016/wordml/cid" xmlns:w16="http://schemas.microsoft.com/office/word/2018/wordml" xmlns:w16du="http://schemas.microsoft.com/office/word/2023/wordml/word16du" xmlns:w16sdtdh="http://schemas.microsoft.com/office/word/2020/wordml/sdtdatahash" xmlns:w16se="http://schemas.microsoft.com/office/word/2015/wordml/symex" xmlns:wpg="http://schemas.microsoft.com/office/word/2010/wordprocessingGroup" xmlns:wpi="http://schemas.microsoft.com/office/word/2010/wordprocessingInk" xmlns:wne="http://schemas.microsoft.com/office/word/2006/wordml" xmlns:wps="http://schemas.microsoft.com/office/word/2010/wordprocessingShape" mc:Ignorable="w14 w15 w16se w16cid w16 w16cex w16sdtdh w16du wp14">
+  <w:abstractNum w:abstractNumId="0" w15:restartNumberingAfterBreak="0">
+    <w:nsid w:val="1C070033"/>
+    <w:multiLevelType w:val="hybridMultilevel"/>
+    <w:tmpl w:val="8230E6E4"/>
+    <w:lvl w:ilvl="0" w:tplc="04090001">
+      <w:start w:val="1"/>
+      <w:numFmt w:val="bullet"/>
+      <w:lvlText w:val=""/>
+      <w:lvlJc w:val="left"/>
+      <w:pPr>
+        <w:ind w:left="720" w:hanging="360"/>
+      </w:pPr>
+      <w:rPr>
+        <w:rFonts w:ascii="Symbol" w:hAnsi="Symbol" w:hint="default"/>
+      </w:rPr>
+    </w:lvl>
+    <w:lvl w:ilvl="1" w:tplc="04090003" w:tentative="1">
+      <w:start w:val="1"/>
+      <w:numFmt w:val="bullet"/>
+      <w:lvlText w:val="o"/>
+      <w:lvlJc w:val="left"/>
+      <w:pPr>
+        <w:ind w:left="1440" w:hanging="360"/>
+      </w:pPr>
+      <w:rPr>
+        <w:rFonts w:ascii="Courier New" w:hAnsi="Courier New" w:cs="Courier New" w:hint="default"/>
+      </w:rPr>
+    </w:lvl>
+    <w:lvl w:ilvl="2" w:tplc="04090005" w:tentative="1">
+      <w:start w:val="1"/>
+      <w:numFmt w:val="bullet"/>
+      <w:lvlText w:val=""/>
+      <w:lvlJc w:val="left"/>
+      <w:pPr>
+        <w:ind w:left="2160" w:hanging="360"/>
+      </w:pPr>
+      <w:rPr>
+        <w:rFonts w:ascii="Wingdings" w:hAnsi="Wingdings" w:hint="default"/>
+      </w:rPr>
+    </w:lvl>
+    <w:lvl w:ilvl="3" w:tplc="04090001" w:tentative="1">
+      <w:start w:val="1"/>
+      <w:numFmt w:val="bullet"/>
+      <w:lvlText w:val=""/>
+      <w:lvlJc w:val="left"/>
+      <w:pPr>
+        <w:ind w:left="2880" w:hanging="360"/>
+      </w:pPr>
+      <w:rPr>
+        <w:rFonts w:ascii="Symbol" w:hAnsi="Symbol" w:hint="default"/>
+      </w:rPr>
+    </w:lvl>
+    <w:lvl w:ilvl="4" w:tplc="04090003" w:tentative="1">
+      <w:start w:val="1"/>
+      <w:numFmt w:val="bullet"/>
+      <w:lvlText w:val="o"/>
+      <w:lvlJc w:val="left"/>
+      <w:pPr>
+        <w:ind w:left="3600" w:hanging="360"/>
+      </w:pPr>
+      <w:rPr>
+        <w:rFonts w:ascii="Courier New" w:hAnsi="Courier New" w:cs="Courier New" w:hint="default"/>
+      </w:rPr>
+    </w:lvl>
+    <w:lvl w:ilvl="5" w:tplc="04090005" w:tentative="1">
+      <w:start w:val="1"/>
+      <w:numFmt w:val="bullet"/>
+      <w:lvlText w:val=""/>
+      <w:lvlJc w:val="left"/>
+      <w:pPr>
+        <w:ind w:left="4320" w:hanging="360"/>
+      </w:pPr>
+      <w:rPr>
+        <w:rFonts w:ascii="Wingdings" w:hAnsi="Wingdings" w:hint="default"/>
+      </w:rPr>
+    </w:lvl>
+    <w:lvl w:ilvl="6" w:tplc="04090001" w:tentative="1">
+      <w:start w:val="1"/>
+      <w:numFmt w:val="bullet"/>
+      <w:lvlText w:val=""/>
+      <w:lvlJc w:val="left"/>
+      <w:pPr>
+        <w:ind w:left="5040" w:hanging="360"/>
+      </w:pPr>
+      <w:rPr>
+        <w:rFonts w:ascii="Symbol" w:hAnsi="Symbol" w:hint="default"/>
+      </w:rPr>
+    </w:lvl>
+    <w:lvl w:ilvl="7" w:tplc="04090003" w:tentative="1">
+      <w:start w:val="1"/>
+      <w:numFmt w:val="bullet"/>
+      <w:lvlText w:val="o"/>
+      <w:lvlJc w:val="left"/>
+      <w:pPr>
+        <w:ind w:left="5760" w:hanging="360"/>
+      </w:pPr>
+      <w:rPr>
+        <w:rFonts w:ascii="Courier New" w:hAnsi="Courier New" w:cs="Courier New" w:hint="default"/>
+      </w:rPr>
+    </w:lvl>
+    <w:lvl w:ilvl="8" w:tplc="04090005" w:tentative="1">
+      <w:start w:val="1"/>
+      <w:numFmt w:val="bullet"/>
+      <w:lvlText w:val=""/>
+      <w:lvlJc w:val="left"/>
+      <w:pPr>
+        <w:ind w:left="6480" w:hanging="360"/>
+      </w:pPr>
+      <w:rPr>
+        <w:rFonts w:ascii="Wingdings" w:hAnsi="Wingdings" w:hint="default"/>
+      </w:rPr>
+    </w:lvl>
+  </w:abstractNum>
+  <w:abstractNum w:abstractNumId="1" w15:restartNumberingAfterBreak="0">
+    <w:nsid w:val="71EC454E"/>
+    <w:multiLevelType w:val="hybridMultilevel"/>
+    <w:tmpl w:val="2E46947E"/>
+    <w:lvl w:ilvl="0" w:tplc="04090001">
+      <w:start w:val="1"/>
+      <w:numFmt w:val="bullet"/>
+      <w:lvlText w:val=""/>
+      <w:lvlJc w:val="left"/>
+      <w:pPr>
+        <w:ind w:left="720" w:hanging="360"/>
+      </w:pPr>
+      <w:rPr>
+        <w:rFonts w:ascii="Symbol" w:hAnsi="Symbol" w:hint="default"/>
+      </w:rPr>
+    </w:lvl>
+    <w:lvl w:ilvl="1" w:tplc="04090003">
+      <w:start w:val="1"/>
+      <w:numFmt w:val="bullet"/>
+      <w:lvlText w:val="o"/>
+      <w:lvlJc w:val="left"/>
+      <w:pPr>
+        <w:ind w:left="1440" w:hanging="360"/>
+      </w:pPr>
+      <w:rPr>
+        <w:rFonts w:ascii="Courier New" w:hAnsi="Courier New" w:cs="Courier New" w:hint="default"/>
+      </w:rPr>
+    </w:lvl>
+    <w:lvl w:ilvl="2" w:tplc="04090005">
+      <w:start w:val="1"/>
+      <w:numFmt w:val="bullet"/>
+      <w:lvlText w:val=""/>
+      <w:lvlJc w:val="left"/>
+      <w:pPr>
+        <w:ind w:left="2160" w:hanging="360"/>
+      </w:pPr>
+      <w:rPr>
+        <w:rFonts w:ascii="Wingdings" w:hAnsi="Wingdings" w:hint="default"/>
+      </w:rPr>
+    </w:lvl>
+    <w:lvl w:ilvl="3" w:tplc="04090001" w:tentative="1">
+      <w:start w:val="1"/>
+      <w:numFmt w:val="bullet"/>
+      <w:lvlText w:val=""/>
+      <w:lvlJc w:val="left"/>
+      <w:pPr>
+        <w:ind w:left="2880" w:hanging="360"/>
+      </w:pPr>
+      <w:rPr>
+        <w:rFonts w:ascii="Symbol" w:hAnsi="Symbol" w:hint="default"/>
+      </w:rPr>
+    </w:lvl>
+    <w:lvl w:ilvl="4" w:tplc="04090003" w:tentative="1">
+      <w:start w:val="1"/>
+      <w:numFmt w:val="bullet"/>
+      <w:lvlText w:val="o"/>
+      <w:lvlJc w:val="left"/>
+      <w:pPr>
+        <w:ind w:left="3600" w:hanging="360"/>
+      </w:pPr>
+      <w:rPr>
+        <w:rFonts w:ascii="Courier New" w:hAnsi="Courier New" w:cs="Courier New" w:hint="default"/>
+      </w:rPr>
+    </w:lvl>
+    <w:lvl w:ilvl="5" w:tplc="04090005" w:tentative="1">
+      <w:start w:val="1"/>
+      <w:numFmt w:val="bullet"/>
+      <w:lvlText w:val=""/>
+      <w:lvlJc w:val="left"/>
+      <w:pPr>
+        <w:ind w:left="4320" w:hanging="360"/>
+      </w:pPr>
+      <w:rPr>
+        <w:rFonts w:ascii="Wingdings" w:hAnsi="Wingdings" w:hint="default"/>
+      </w:rPr>
+    </w:lvl>
+    <w:lvl w:ilvl="6" w:tplc="04090001" w:tentative="1">
+      <w:start w:val="1"/>
+      <w:numFmt w:val="bullet"/>
+      <w:lvlText w:val=""/>
+      <w:lvlJc w:val="left"/>
+      <w:pPr>
+        <w:ind w:left="5040" w:hanging="360"/>
+      </w:pPr>
+      <w:rPr>
+        <w:rFonts w:ascii="Symbol" w:hAnsi="Symbol" w:hint="default"/>
+      </w:rPr>
+    </w:lvl>
+    <w:lvl w:ilvl="7" w:tplc="04090003" w:tentative="1">
+      <w:start w:val="1"/>
+      <w:numFmt w:val="bullet"/>
+      <w:lvlText w:val="o"/>
+      <w:lvlJc w:val="left"/>
+      <w:pPr>
+        <w:ind w:left="5760" w:hanging="360"/>
+      </w:pPr>
+      <w:rPr>
+        <w:rFonts w:ascii="Courier New" w:hAnsi="Courier New" w:cs="Courier New" w:hint="default"/>
+      </w:rPr>
+    </w:lvl>
+    <w:lvl w:ilvl="8" w:tplc="04090005" w:tentative="1">
+      <w:start w:val="1"/>
+      <w:numFmt w:val="bullet"/>
+      <w:lvlText w:val=""/>
+      <w:lvlJc w:val="left"/>
+      <w:pPr>
+        <w:ind w:left="6480" w:hanging="360"/>
+      </w:pPr>
+      <w:rPr>
+        <w:rFonts w:ascii="Wingdings" w:hAnsi="Wingdings" w:hint="default"/>
+      </w:rPr>
+    </w:lvl>
+  </w:abstractNum>
+  <w:num w:numId="1" w16cid:durableId="335226582">
+    <w:abstractNumId w:val="0"/>
+  </w:num>
+  <w:num w:numId="2" w16cid:durableId="780611956">
+    <w:abstractNumId w:val="1"/>
+  </w:num>
+</w:numbering>
 </file>
 
 <file path=word/styles.xml><?xml version="1.0" encoding="utf-8"?>

</xml_diff>

<commit_message>
started typing something in project statement
</commit_message>
<xml_diff>
--- a/Naurot_3.docx
+++ b/Naurot_3.docx
@@ -210,7 +210,16 @@
     <w:p>
       <w:r>
         <w:lastRenderedPageBreak/>
-        <w:t>Problem Statement</w:t>
+        <w:t xml:space="preserve"> Our project, a recipe website, allows users to view, create, and share recipes. </w:t>
+      </w:r>
+      <w:r>
+        <w:t>Our website will establish a community of foodies, cooks, and people who love perusing recipes.</w:t>
+      </w:r>
+      <w:r>
+        <w:t xml:space="preserve"> </w:t>
+      </w:r>
+      <w:r>
+        <w:t>While there are other sites, such as food.com and allrecipes.com, our website will contain an AI component that will allow a user to enter an ingredient list and find recipes (hopefully) with a similar ingredient list.</w:t>
       </w:r>
     </w:p>
     <w:p>

</xml_diff>